<commit_message>
Add live Streamlit demo URL to report and slide source
</commit_message>
<xml_diff>
--- a/REPORT.docx
+++ b/REPORT.docx
@@ -35,6 +35,36 @@
           <w:i w:val="0"/>
         </w:rPr>
         <w:t>Date: June 2026   |   Track: Movies — MovieLens Latest Small</w:t>
+      </w:r>
+    </w:p>
+    <w:p>
+      <w:r>
+        <w:rPr>
+          <w:b/>
+          <w:i w:val="0"/>
+        </w:rPr>
+        <w:t xml:space="preserve">Live demo: </w:t>
+      </w:r>
+      <w:r>
+        <w:rPr>
+          <w:color w:val="2E6FF2"/>
+        </w:rPr>
+        <w:t>https://movie-recommender-systems-bgvfxcjsf7myfvfxjyircb.streamlit.app</w:t>
+      </w:r>
+    </w:p>
+    <w:p>
+      <w:r>
+        <w:rPr>
+          <w:b/>
+          <w:i w:val="0"/>
+        </w:rPr>
+        <w:t xml:space="preserve">Code: </w:t>
+      </w:r>
+      <w:r>
+        <w:rPr>
+          <w:color w:val="2E6FF2"/>
+        </w:rPr>
+        <w:t>https://github.com/HiroakiNakano1985/Movie-Recommender-Systems</w:t>
       </w:r>
     </w:p>
     <w:p>
@@ -2760,6 +2790,21 @@
     <w:p>
       <w:r>
         <w:rPr>
+          <w:b/>
+          <w:i w:val="0"/>
+        </w:rPr>
+        <w:t xml:space="preserve">Live demo (no setup needed): </w:t>
+      </w:r>
+      <w:r>
+        <w:rPr>
+          <w:color w:val="2E6FF2"/>
+        </w:rPr>
+        <w:t>https://movie-recommender-systems-bgvfxcjsf7myfvfxjyircb.streamlit.app</w:t>
+      </w:r>
+    </w:p>
+    <w:p>
+      <w:r>
+        <w:rPr>
           <w:rFonts w:ascii="Consolas" w:hAnsi="Consolas"/>
           <w:sz w:val="19"/>
         </w:rPr>

</xml_diff>